<commit_message>
feat(pastry-shop-guide-en): entregables definitivos tras la revisión (guía 113 págs., bonus 39, plan, 8 xlsx con gate)
Via: Claude Code
Co-Authored-By: Claude Opus 5.5 <noreply@anthropic.com>
</commit_message>
<xml_diff>
--- a/astro-site/public/dl/how-to-open-a-pastry-shop/BONUS-12-opening-decisions.docx
+++ b/astro-site/public/dl/how-to-open-a-pastry-shop/BONUS-12-opening-decisions.docx
@@ -38,7 +38,7 @@
           <w:b w:val="0"/>
           <w:i w:val="0"/>
         </w:rPr>
-        <w:t>Twelve decisions you have to make before you open a pastry shop, and that almost never get settled with a single number: buy the blast chiller or wait, open with twenty items or forty, take your first First Communion cake order with no track record, start legally from home, sign your first wholesale account. Each one comes with its context, its options, the criterion you decide by, the cell in the pack that settles it and the rule that applies when there is one (the US rule, checked against official sources in October 2026, as in the guide). There isn't a single made-up figure: every number comes from a cell you can open and check.</w:t>
+        <w:t>Twelve decisions you have to make before you open a pastry shop, and that almost never get settled with a single number: buy the blast chiller or wait, open with twenty items or forty, take your first First Communion cake order with no track record, start legally from home, sign your first wholesale account. Each one comes with its context, its options, the criterion you decide by, the cell in the pack that settles it and the rule that applies when there is one (the US rule, checked against official sources in October 2026, as in the guide). There isn't a single made-up figure: every number about the case comes from a cell you can open and check, and every outside figure names its source.</w:t>
       </w:r>
     </w:p>
     <w:p>
@@ -897,7 +897,7 @@
                 <w:b w:val="0"/>
                 <w:i w:val="0"/>
               </w:rPr>
-              <w:t>Adds seating, a coffee bar, an espresso machine and customer restrooms. The moment people eat at your tables, two things change: sales tax (pastries to go are generally exempt in the four example states; what's eaten on site generally isn't) and, in New York and Florida, the agency that permits you.</w:t>
+              <w:t>Adds seating, a coffee bar, an espresso machine and customer restrooms. The moment people eat at your tables, two things change: sales tax (pastries to go are generally exempt in the four example states; what's eaten on site generally isn't; in Texas, the trigger is your plates or utensils) and, in New York and Florida, the agency that permits you.</w:t>
             </w:r>
           </w:p>
         </w:tc>
@@ -1292,7 +1292,7 @@
                 <w:b w:val="0"/>
                 <w:i w:val="0"/>
               </w:rPr>
-              <w:t>Planetary mixer, 20 qt</w:t>
+              <w:t>Planetary mixer, 20 L (about 21 qt)</w:t>
             </w:r>
           </w:p>
         </w:tc>
@@ -1369,7 +1369,7 @@
                 <w:b w:val="0"/>
                 <w:i w:val="0"/>
               </w:rPr>
-              <w:t>Automatic dough sheeter, up to 16 in wide</w:t>
+              <w:t>Dough sheeter, up to 16 in wide</w:t>
             </w:r>
           </w:p>
         </w:tc>
@@ -1754,7 +1754,7 @@
                 <w:b w:val="0"/>
                 <w:i w:val="0"/>
               </w:rPr>
-              <w:t>Walk-in cooler, 8 m³ (about 283 cu ft)</w:t>
+              <w:t>Walk-in cooler, about 283 cu ft (8 m³)</w:t>
             </w:r>
           </w:p>
         </w:tc>
@@ -9250,7 +9250,7 @@
           <w:b w:val="0"/>
           <w:i w:val="0"/>
         </w:rPr>
-        <w:t>In a pastry shop, what doesn't sell today doesn't wait for tomorrow at full price: the refrigerated case holds 15 items, and all 15 are TCS food that needs a date mark as soon as you hold it past 24 hours, so at closing there isn't much room to think "I'll put it out again tomorrow". In year one that urgency gets worse, because you don't know the demand for each item yet: you order on gut feeling, not on history, and waste runs high while you learn what sells and how much. That learning has a double cost, in two opposite directions: you throw out product that could have sold with a small push, and at the same time you sell product you shouldn't be selling anymore, because nobody decided at what point it stops being fit to offer as is. Both come from the same cause: not having your end-of-day policy written down before you open. Without it, every counter associate improvises their own criterion, and one afternoon's criterion doesn't match the next one's.</w:t>
+        <w:t>In a pastry shop, what doesn't sell today doesn't wait for tomorrow at full price: the refrigerated case holds 15 items, and the model treats all 15 as TCS food that needs a date mark as soon as you hold it past 24 hours, so at closing there isn't much room to think "I'll put it out again tomorrow". In year one that urgency gets worse, because you don't know the demand for each item yet: you order on gut feeling, not on history, and waste runs high while you learn what sells and how much. That learning has a double cost, in two opposite directions: you throw out product that could have sold with a small push, and at the same time you sell product you shouldn't be selling anymore, because nobody decided at what point it stops being fit to offer as is. Both come from the same cause: not having your end-of-day policy written down before you open. Without it, every counter associate improvises their own criterion, and one afternoon's criterion doesn't match the next one's.</w:t>
       </w:r>
     </w:p>
     <w:p>
@@ -9420,7 +9420,7 @@
           <w:b w:val="0"/>
           <w:i w:val="0"/>
         </w:rPr>
-        <w:t>The recommendation, with what would change it: start with option B on the day-old rack, because it gets back more dollars than donating or staff meals and doesn't call for lining up a nonprofit to pick up; move to option C only when what's left over each night is more than that rack can absorb without devaluing the rest of the case; and keep option D for pieces that are still safe but no longer presentable enough for the rack. Anything past its date mark goes in the bin, not to the staff table.</w:t>
+        <w:t>The recommendation, with what would change it: start with option B on the day-old rack, because it gets back more dollars than donating or staff meals and doesn't call for lining up a nonprofit to pick up; move to option C only when what's left over each night is more than that rack can absorb without devaluing the rest of the case; and keep option D for pieces that are still safe but no longer presentable enough for the rack. Anything past its date mark goes in the trash, not to the staff table.</w:t>
       </w:r>
     </w:p>
     <w:p>

</xml_diff>